<commit_message>
feat(resume): remove Senior title at Zukk and salary expectation; add ATS PDFs and month-based snapshot names
Co-Authored-By: Claude Sonnet 5.5 <noreply@anthropic.com>
</commit_message>
<xml_diff>
--- a/Lucas-Bueno-Cesario-Curriculo-Gupy.docx
+++ b/Lucas-Bueno-Cesario-Curriculo-Gupy.docx
@@ -588,7 +588,7 @@
           <w:color w:val="000000"/>
           <w:sz w:val="22"/>
         </w:rPr>
-        <w:t>Desenvolvedor Java Full Stack Sênior</w:t>
+        <w:t>Desenvolvedor Java Full Stack</w:t>
       </w:r>
     </w:p>
     <w:p>
@@ -1623,29 +1623,6 @@
           <w:color w:val="000000"/>
           <w:sz w:val="20"/>
         </w:rPr>
-        <w:t xml:space="preserve">Pretensão salarial: </w:t>
-      </w:r>
-      <w:r>
-        <w:rPr>
-          <w:rFonts w:ascii="Arial" w:hAnsi="Arial" w:cs="Arial" w:eastAsia="Arial"/>
-          <w:b w:val="0"/>
-          <w:color w:val="000000"/>
-          <w:sz w:val="20"/>
-        </w:rPr>
-        <w:t>R$ 8.500 a R$ 10.500 por mês (CLT) ou R$ 13.000 a R$ 15.000 por mês (PJ)</w:t>
-      </w:r>
-    </w:p>
-    <w:p>
-      <w:pPr>
-        <w:spacing w:before="0" w:after="20" w:line="259" w:lineRule="auto"/>
-      </w:pPr>
-      <w:r>
-        <w:rPr>
-          <w:rFonts w:ascii="Arial" w:hAnsi="Arial" w:cs="Arial" w:eastAsia="Arial"/>
-          <w:b/>
-          <w:color w:val="000000"/>
-          <w:sz w:val="20"/>
-        </w:rPr>
         <w:t xml:space="preserve">Disponibilidade: </w:t>
       </w:r>
       <w:r>

</xml_diff>